<commit_message>
Re-audit report: add alignment with the official PJPS instructions (4A), D25/D26 resolved
</commit_message>
<xml_diff>
--- a/docs/PJPS-Platform-Re-Audit-Report.docx
+++ b/docs/PJPS-Platform-Re-Audit-Report.docx
@@ -532,7 +532,7 @@
                 <w:sz w:val="18"/>
                 <w:szCs w:val="18"/>
               </w:rPr>
-              <w:t xml:space="preserve">Requirements: docs/PJPS-Final-4-Modules.txt (rev. 2). Code: commit 46734a3 plus three uncommitted source changes (see D25), branch main.</w:t>
+              <w:t xml:space="preserve">Requirements: docs/PJPS-Final-4-Modules.txt (rev. 2). Code: commit 46734a3 plus three uncommitted source changes at the time of testing (D25, committed afterwards), then the PJPS-guidelines alignment (commits 3266728 and f73e8b2, section 4A). Branch main. Official style source: pjps.pk/instructions/instructions-for-authors, read 26 Oct 2026.</w:t>
             </w:r>
           </w:p>
         </w:tc>
@@ -2006,7 +2006,7 @@
                 <w:sz w:val="18"/>
                 <w:szCs w:val="18"/>
               </w:rPr>
-              <w:t xml:space="preserve">1 not re-tested. Five new findings (D21–D25): none high, 3 medium, 2 low.</w:t>
+              <w:t xml:space="preserve">1 not re-tested. Six new findings (D21–D26): none high, 4 medium, 2 low; D25 and D26 already resolved.</w:t>
             </w:r>
           </w:p>
         </w:tc>
@@ -2272,6 +2272,36 @@
           <w:sz w:val="21"/>
           <w:szCs w:val="21"/>
         </w:rPr>
+        <w:t xml:space="preserve">PJPS style: </w:t>
+      </w:r>
+      <w:r>
+        <w:rPr>
+          <w:rFonts w:ascii="Calibri" w:cs="Calibri" w:eastAsia="Calibri" w:hAnsi="Calibri"/>
+          <w:color w:val="1F2A37"/>
+          <w:sz w:val="21"/>
+          <w:szCs w:val="21"/>
+        </w:rPr>
+        <w:t xml:space="preserve">the built-in PJPS reference style was compared with the official Instructions for Authors and corrected (all authors listed, chapter and website formats, no DOI, italic journal, bold volume). The three official examples now pass as a test. See section 4A.</w:t>
+      </w:r>
+    </w:p>
+    <w:p>
+      <w:pPr>
+        <w:pStyle w:val="ListParagraph"/>
+        <w:numPr>
+          <w:ilvl w:val="0"/>
+          <w:numId w:val="2"/>
+        </w:numPr>
+        <w:spacing w:after="60" w:line="276"/>
+      </w:pPr>
+      <w:r>
+        <w:rPr>
+          <w:rFonts w:ascii="Calibri" w:cs="Calibri" w:eastAsia="Calibri" w:hAnsi="Calibri"/>
+          <w:b/>
+          <w:bCs/>
+          <w:color w:val="1F2A37"/>
+          <w:sz w:val="21"/>
+          <w:szCs w:val="21"/>
+        </w:rPr>
         <w:t xml:space="preserve">Process: </w:t>
       </w:r>
       <w:r>
@@ -2281,7 +2311,7 @@
           <w:sz w:val="21"/>
           <w:szCs w:val="21"/>
         </w:rPr>
-        <w:t xml:space="preserve">part of the fixes sits in uncommitted files, so a deployment from the last commit would lack them. Commit before any release.</w:t>
+        <w:t xml:space="preserve">the fixes that were uncommitted during testing (D25) have since been committed and pushed, so the deployed code now includes them.</w:t>
       </w:r>
     </w:p>
     <w:p>
@@ -3171,7 +3201,7 @@
           <w:sz w:val="21"/>
           <w:szCs w:val="21"/>
         </w:rPr>
-        <w:t xml:space="preserve">The audit ran on the working copy, which includes three uncommitted source edits (D25).</w:t>
+        <w:t xml:space="preserve">The audit tests ran on the working copy, which included three uncommitted source edits (D25, since committed). The numbers in section 4 were measured before the PJPS-style alignment of section 4A; only the Module 2 audit and npm test were re-run afterwards, not the whole audit.</w:t>
       </w:r>
     </w:p>
     <w:p>
@@ -8737,7 +8767,7 @@
                 <w:sz w:val="18"/>
                 <w:szCs w:val="18"/>
               </w:rPr>
-              <w:t xml:space="preserve">14/14 planted rule breaks found, 0 false alarms; 6/6 in-text rules; order and suffix rules.</w:t>
+              <w:t xml:space="preserve">14/14 planted rule breaks found, 0 false alarms; 6/6 in-text rules; order and suffix rules. Re-aligned with the official instructions after the audit (section 4A): all authors listed, chapter and website rules; still 14/14.</w:t>
             </w:r>
           </w:p>
         </w:tc>
@@ -8904,7 +8934,7 @@
                 <w:sz w:val="18"/>
                 <w:szCs w:val="18"/>
               </w:rPr>
-              <w:t xml:space="preserve">5 of 7 source styles give exactly the PJPS text (audit 1: 0 of 7); no crash; no lost author. Chicago keeps title case, Nature drops the issue. Filling missing fields from the matched record was not demonstrated (0 of 3 matched in the test).</w:t>
+              <w:t xml:space="preserve">5 of 7 source styles give exactly the PJPS text (audit 1: 0 of 7); no crash; no lost author. Chicago keeps title case, Nature drops the issue. Filling missing fields from the matched record was not demonstrated (0 of 3 matched in the test). Since then: PJPS output also has chapter and website formats, italic journal and bold volume (4A).</w:t>
             </w:r>
           </w:p>
         </w:tc>
@@ -19235,6 +19265,1446 @@
     </w:p>
     <w:p>
       <w:pPr>
+        <w:pStyle w:val="Heading2"/>
+        <w:spacing w:after="120" w:before="280"/>
+      </w:pPr>
+      <w:r>
+        <w:rPr>
+          <w:rFonts w:ascii="Calibri" w:cs="Calibri" w:eastAsia="Calibri" w:hAnsi="Calibri"/>
+          <w:b/>
+          <w:bCs/>
+          <w:color w:val="0F4C5C"/>
+          <w:sz w:val="26"/>
+          <w:szCs w:val="26"/>
+        </w:rPr>
+        <w:t xml:space="preserve">4A. Alignment with the official PJPS Instructions for Authors</w:t>
+      </w:r>
+    </w:p>
+    <w:p>
+      <w:pPr>
+        <w:spacing w:after="120" w:line="288"/>
+      </w:pPr>
+      <w:r>
+        <w:rPr>
+          <w:rFonts w:ascii="Calibri" w:cs="Calibri" w:eastAsia="Calibri" w:hAnsi="Calibri"/>
+          <w:color w:val="1F2A37"/>
+          <w:sz w:val="21"/>
+          <w:szCs w:val="21"/>
+        </w:rPr>
+        <w:t xml:space="preserve">After the main audit, the reference rules on the journal's own page (pjps.pk/instructions/instructions-for-authors, section "References") were compared with the app's built-in PJPS style, and the differences were fixed the same day. This answers the specification's own caveat, "confirm with the current PJPS author guidelines".</w:t>
+      </w:r>
+    </w:p>
+    <w:tbl>
+      <w:tblPr>
+        <w:tblW w:type="dxa" w:w="10466"/>
+        <w:tblBorders>
+          <w:top w:val="single" w:color="auto" w:sz="4"/>
+          <w:left w:val="single" w:color="auto" w:sz="4"/>
+          <w:bottom w:val="single" w:color="auto" w:sz="4"/>
+          <w:right w:val="single" w:color="auto" w:sz="4"/>
+          <w:insideH w:val="single" w:color="auto" w:sz="4"/>
+          <w:insideV w:val="single" w:color="auto" w:sz="4"/>
+        </w:tblBorders>
+      </w:tblPr>
+      <w:tblGrid>
+        <w:gridCol w:w="2300"/>
+        <w:gridCol w:w="3000"/>
+        <w:gridCol w:w="2300"/>
+        <w:gridCol w:w="2866"/>
+      </w:tblGrid>
+      <w:tr>
+        <w:trPr>
+          <w:tblHeader/>
+        </w:trPr>
+        <w:tc>
+          <w:tcPr>
+            <w:tcW w:type="dxa" w:w="2300"/>
+            <w:tcBorders>
+              <w:top w:val="single" w:color="C9D1D9" w:sz="4"/>
+              <w:left w:val="single" w:color="C9D1D9" w:sz="4"/>
+              <w:bottom w:val="single" w:color="C9D1D9" w:sz="4"/>
+              <w:right w:val="single" w:color="C9D1D9" w:sz="4"/>
+            </w:tcBorders>
+            <w:shd w:fill="0F4C5C" w:color="auto" w:val="clear"/>
+            <w:tcMar>
+              <w:top w:type="dxa" w:w="60"/>
+              <w:left w:type="dxa" w:w="90"/>
+              <w:bottom w:type="dxa" w:w="60"/>
+              <w:right w:type="dxa" w:w="90"/>
+            </w:tcMar>
+            <w:vAlign w:val="top"/>
+          </w:tcPr>
+          <w:p>
+            <w:pPr>
+              <w:spacing w:after="20"/>
+            </w:pPr>
+            <w:r>
+              <w:rPr>
+                <w:rFonts w:ascii="Calibri" w:cs="Calibri" w:eastAsia="Calibri" w:hAnsi="Calibri"/>
+                <w:b/>
+                <w:bCs/>
+                <w:color w:val="FFFFFF"/>
+                <w:sz w:val="18"/>
+                <w:szCs w:val="18"/>
+              </w:rPr>
+              <w:t xml:space="preserve">Rule</w:t>
+            </w:r>
+          </w:p>
+        </w:tc>
+        <w:tc>
+          <w:tcPr>
+            <w:tcW w:type="dxa" w:w="3000"/>
+            <w:tcBorders>
+              <w:top w:val="single" w:color="C9D1D9" w:sz="4"/>
+              <w:left w:val="single" w:color="C9D1D9" w:sz="4"/>
+              <w:bottom w:val="single" w:color="C9D1D9" w:sz="4"/>
+              <w:right w:val="single" w:color="C9D1D9" w:sz="4"/>
+            </w:tcBorders>
+            <w:shd w:fill="0F4C5C" w:color="auto" w:val="clear"/>
+            <w:tcMar>
+              <w:top w:type="dxa" w:w="60"/>
+              <w:left w:type="dxa" w:w="90"/>
+              <w:bottom w:type="dxa" w:w="60"/>
+              <w:right w:type="dxa" w:w="90"/>
+            </w:tcMar>
+            <w:vAlign w:val="top"/>
+          </w:tcPr>
+          <w:p>
+            <w:pPr>
+              <w:spacing w:after="20"/>
+            </w:pPr>
+            <w:r>
+              <w:rPr>
+                <w:rFonts w:ascii="Calibri" w:cs="Calibri" w:eastAsia="Calibri" w:hAnsi="Calibri"/>
+                <w:b/>
+                <w:bCs/>
+                <w:color w:val="FFFFFF"/>
+                <w:sz w:val="18"/>
+                <w:szCs w:val="18"/>
+              </w:rPr>
+              <w:t xml:space="preserve">Official instruction</w:t>
+            </w:r>
+          </w:p>
+        </w:tc>
+        <w:tc>
+          <w:tcPr>
+            <w:tcW w:type="dxa" w:w="2300"/>
+            <w:tcBorders>
+              <w:top w:val="single" w:color="C9D1D9" w:sz="4"/>
+              <w:left w:val="single" w:color="C9D1D9" w:sz="4"/>
+              <w:bottom w:val="single" w:color="C9D1D9" w:sz="4"/>
+              <w:right w:val="single" w:color="C9D1D9" w:sz="4"/>
+            </w:tcBorders>
+            <w:shd w:fill="0F4C5C" w:color="auto" w:val="clear"/>
+            <w:tcMar>
+              <w:top w:type="dxa" w:w="60"/>
+              <w:left w:type="dxa" w:w="90"/>
+              <w:bottom w:type="dxa" w:w="60"/>
+              <w:right w:type="dxa" w:w="90"/>
+            </w:tcMar>
+            <w:vAlign w:val="top"/>
+          </w:tcPr>
+          <w:p>
+            <w:pPr>
+              <w:spacing w:after="20"/>
+            </w:pPr>
+            <w:r>
+              <w:rPr>
+                <w:rFonts w:ascii="Calibri" w:cs="Calibri" w:eastAsia="Calibri" w:hAnsi="Calibri"/>
+                <w:b/>
+                <w:bCs/>
+                <w:color w:val="FFFFFF"/>
+                <w:sz w:val="18"/>
+                <w:szCs w:val="18"/>
+              </w:rPr>
+              <w:t xml:space="preserve">App before</w:t>
+            </w:r>
+          </w:p>
+        </w:tc>
+        <w:tc>
+          <w:tcPr>
+            <w:tcW w:type="dxa" w:w="2866"/>
+            <w:tcBorders>
+              <w:top w:val="single" w:color="C9D1D9" w:sz="4"/>
+              <w:left w:val="single" w:color="C9D1D9" w:sz="4"/>
+              <w:bottom w:val="single" w:color="C9D1D9" w:sz="4"/>
+              <w:right w:val="single" w:color="C9D1D9" w:sz="4"/>
+            </w:tcBorders>
+            <w:shd w:fill="0F4C5C" w:color="auto" w:val="clear"/>
+            <w:tcMar>
+              <w:top w:type="dxa" w:w="60"/>
+              <w:left w:type="dxa" w:w="90"/>
+              <w:bottom w:type="dxa" w:w="60"/>
+              <w:right w:type="dxa" w:w="90"/>
+            </w:tcMar>
+            <w:vAlign w:val="top"/>
+          </w:tcPr>
+          <w:p>
+            <w:pPr>
+              <w:spacing w:after="20"/>
+            </w:pPr>
+            <w:r>
+              <w:rPr>
+                <w:rFonts w:ascii="Calibri" w:cs="Calibri" w:eastAsia="Calibri" w:hAnsi="Calibri"/>
+                <w:b/>
+                <w:bCs/>
+                <w:color w:val="FFFFFF"/>
+                <w:sz w:val="18"/>
+                <w:szCs w:val="18"/>
+              </w:rPr>
+              <w:t xml:space="preserve">App now</w:t>
+            </w:r>
+          </w:p>
+        </w:tc>
+      </w:tr>
+      <w:tr>
+        <w:trPr>
+          <w:cantSplit/>
+        </w:trPr>
+        <w:tc>
+          <w:tcPr>
+            <w:tcW w:type="dxa" w:w="2300"/>
+            <w:tcBorders>
+              <w:top w:val="single" w:color="C9D1D9" w:sz="4"/>
+              <w:left w:val="single" w:color="C9D1D9" w:sz="4"/>
+              <w:bottom w:val="single" w:color="C9D1D9" w:sz="4"/>
+              <w:right w:val="single" w:color="C9D1D9" w:sz="4"/>
+            </w:tcBorders>
+            <w:tcMar>
+              <w:top w:type="dxa" w:w="60"/>
+              <w:left w:type="dxa" w:w="90"/>
+              <w:bottom w:type="dxa" w:w="60"/>
+              <w:right w:type="dxa" w:w="90"/>
+            </w:tcMar>
+            <w:vAlign w:val="top"/>
+          </w:tcPr>
+          <w:p>
+            <w:pPr>
+              <w:spacing w:after="20"/>
+            </w:pPr>
+            <w:r>
+              <w:rPr>
+                <w:rFonts w:ascii="Calibri" w:cs="Calibri" w:eastAsia="Calibri" w:hAnsi="Calibri"/>
+                <w:color w:val="1F2A37"/>
+                <w:sz w:val="18"/>
+                <w:szCs w:val="18"/>
+              </w:rPr>
+              <w:t xml:space="preserve">In-text citations</w:t>
+            </w:r>
+          </w:p>
+        </w:tc>
+        <w:tc>
+          <w:tcPr>
+            <w:tcW w:type="dxa" w:w="3000"/>
+            <w:tcBorders>
+              <w:top w:val="single" w:color="C9D1D9" w:sz="4"/>
+              <w:left w:val="single" w:color="C9D1D9" w:sz="4"/>
+              <w:bottom w:val="single" w:color="C9D1D9" w:sz="4"/>
+              <w:right w:val="single" w:color="C9D1D9" w:sz="4"/>
+            </w:tcBorders>
+            <w:tcMar>
+              <w:top w:type="dxa" w:w="60"/>
+              <w:left w:type="dxa" w:w="90"/>
+              <w:bottom w:type="dxa" w:w="60"/>
+              <w:right w:type="dxa" w:w="90"/>
+            </w:tcMar>
+            <w:vAlign w:val="top"/>
+          </w:tcPr>
+          <w:p>
+            <w:pPr>
+              <w:spacing w:after="20"/>
+            </w:pPr>
+            <w:r>
+              <w:rPr>
+                <w:rFonts w:ascii="Calibri" w:cs="Calibri" w:eastAsia="Calibri" w:hAnsi="Calibri"/>
+                <w:color w:val="1F2A37"/>
+                <w:sz w:val="18"/>
+                <w:szCs w:val="18"/>
+              </w:rPr>
+              <w:t xml:space="preserve">Surname and year; (Robinson and Jeong, 2001); et al. for more than two; a/b for same year; semicolons</w:t>
+            </w:r>
+          </w:p>
+        </w:tc>
+        <w:tc>
+          <w:tcPr>
+            <w:tcW w:type="dxa" w:w="2300"/>
+            <w:tcBorders>
+              <w:top w:val="single" w:color="C9D1D9" w:sz="4"/>
+              <w:left w:val="single" w:color="C9D1D9" w:sz="4"/>
+              <w:bottom w:val="single" w:color="C9D1D9" w:sz="4"/>
+              <w:right w:val="single" w:color="C9D1D9" w:sz="4"/>
+            </w:tcBorders>
+            <w:shd w:fill="D9F0DF" w:color="auto" w:val="clear"/>
+            <w:tcMar>
+              <w:top w:type="dxa" w:w="60"/>
+              <w:left w:type="dxa" w:w="90"/>
+              <w:bottom w:type="dxa" w:w="60"/>
+              <w:right w:type="dxa" w:w="90"/>
+            </w:tcMar>
+            <w:vAlign w:val="top"/>
+          </w:tcPr>
+          <w:p>
+            <w:pPr>
+              <w:spacing w:after="20"/>
+            </w:pPr>
+            <w:r>
+              <w:rPr>
+                <w:rFonts w:ascii="Calibri" w:cs="Calibri" w:eastAsia="Calibri" w:hAnsi="Calibri"/>
+                <w:color w:val="1F2A37"/>
+                <w:sz w:val="18"/>
+                <w:szCs w:val="18"/>
+              </w:rPr>
+              <w:t xml:space="preserve">Matched</w:t>
+            </w:r>
+          </w:p>
+        </w:tc>
+        <w:tc>
+          <w:tcPr>
+            <w:tcW w:type="dxa" w:w="2866"/>
+            <w:tcBorders>
+              <w:top w:val="single" w:color="C9D1D9" w:sz="4"/>
+              <w:left w:val="single" w:color="C9D1D9" w:sz="4"/>
+              <w:bottom w:val="single" w:color="C9D1D9" w:sz="4"/>
+              <w:right w:val="single" w:color="C9D1D9" w:sz="4"/>
+            </w:tcBorders>
+            <w:shd w:fill="D9F0DF" w:color="auto" w:val="clear"/>
+            <w:tcMar>
+              <w:top w:type="dxa" w:w="60"/>
+              <w:left w:type="dxa" w:w="90"/>
+              <w:bottom w:type="dxa" w:w="60"/>
+              <w:right w:type="dxa" w:w="90"/>
+            </w:tcMar>
+            <w:vAlign w:val="top"/>
+          </w:tcPr>
+          <w:p>
+            <w:pPr>
+              <w:spacing w:after="20"/>
+            </w:pPr>
+            <w:r>
+              <w:rPr>
+                <w:rFonts w:ascii="Calibri" w:cs="Calibri" w:eastAsia="Calibri" w:hAnsi="Calibri"/>
+                <w:color w:val="1F2A37"/>
+                <w:sz w:val="18"/>
+                <w:szCs w:val="18"/>
+              </w:rPr>
+              <w:t xml:space="preserve">Unchanged, matched</w:t>
+            </w:r>
+          </w:p>
+        </w:tc>
+      </w:tr>
+      <w:tr>
+        <w:trPr>
+          <w:cantSplit/>
+        </w:trPr>
+        <w:tc>
+          <w:tcPr>
+            <w:tcW w:type="dxa" w:w="2300"/>
+            <w:tcBorders>
+              <w:top w:val="single" w:color="C9D1D9" w:sz="4"/>
+              <w:left w:val="single" w:color="C9D1D9" w:sz="4"/>
+              <w:bottom w:val="single" w:color="C9D1D9" w:sz="4"/>
+              <w:right w:val="single" w:color="C9D1D9" w:sz="4"/>
+            </w:tcBorders>
+            <w:tcMar>
+              <w:top w:type="dxa" w:w="60"/>
+              <w:left w:type="dxa" w:w="90"/>
+              <w:bottom w:type="dxa" w:w="60"/>
+              <w:right w:type="dxa" w:w="90"/>
+            </w:tcMar>
+            <w:vAlign w:val="top"/>
+          </w:tcPr>
+          <w:p>
+            <w:pPr>
+              <w:spacing w:after="20"/>
+            </w:pPr>
+            <w:r>
+              <w:rPr>
+                <w:rFonts w:ascii="Calibri" w:cs="Calibri" w:eastAsia="Calibri" w:hAnsi="Calibri"/>
+                <w:color w:val="1F2A37"/>
+                <w:sz w:val="18"/>
+                <w:szCs w:val="18"/>
+              </w:rPr>
+              <w:t xml:space="preserve">Reference list order</w:t>
+            </w:r>
+          </w:p>
+        </w:tc>
+        <w:tc>
+          <w:tcPr>
+            <w:tcW w:type="dxa" w:w="3000"/>
+            <w:tcBorders>
+              <w:top w:val="single" w:color="C9D1D9" w:sz="4"/>
+              <w:left w:val="single" w:color="C9D1D9" w:sz="4"/>
+              <w:bottom w:val="single" w:color="C9D1D9" w:sz="4"/>
+              <w:right w:val="single" w:color="C9D1D9" w:sz="4"/>
+            </w:tcBorders>
+            <w:tcMar>
+              <w:top w:type="dxa" w:w="60"/>
+              <w:left w:type="dxa" w:w="90"/>
+              <w:bottom w:type="dxa" w:w="60"/>
+              <w:right w:type="dxa" w:w="90"/>
+            </w:tcMar>
+            <w:vAlign w:val="top"/>
+          </w:tcPr>
+          <w:p>
+            <w:pPr>
+              <w:spacing w:after="20"/>
+            </w:pPr>
+            <w:r>
+              <w:rPr>
+                <w:rFonts w:ascii="Calibri" w:cs="Calibri" w:eastAsia="Calibri" w:hAnsi="Calibri"/>
+                <w:color w:val="1F2A37"/>
+                <w:sz w:val="18"/>
+                <w:szCs w:val="18"/>
+              </w:rPr>
+              <w:t xml:space="preserve">Alphabetical</w:t>
+            </w:r>
+          </w:p>
+        </w:tc>
+        <w:tc>
+          <w:tcPr>
+            <w:tcW w:type="dxa" w:w="2300"/>
+            <w:tcBorders>
+              <w:top w:val="single" w:color="C9D1D9" w:sz="4"/>
+              <w:left w:val="single" w:color="C9D1D9" w:sz="4"/>
+              <w:bottom w:val="single" w:color="C9D1D9" w:sz="4"/>
+              <w:right w:val="single" w:color="C9D1D9" w:sz="4"/>
+            </w:tcBorders>
+            <w:shd w:fill="D9F0DF" w:color="auto" w:val="clear"/>
+            <w:tcMar>
+              <w:top w:type="dxa" w:w="60"/>
+              <w:left w:type="dxa" w:w="90"/>
+              <w:bottom w:type="dxa" w:w="60"/>
+              <w:right w:type="dxa" w:w="90"/>
+            </w:tcMar>
+            <w:vAlign w:val="top"/>
+          </w:tcPr>
+          <w:p>
+            <w:pPr>
+              <w:spacing w:after="20"/>
+            </w:pPr>
+            <w:r>
+              <w:rPr>
+                <w:rFonts w:ascii="Calibri" w:cs="Calibri" w:eastAsia="Calibri" w:hAnsi="Calibri"/>
+                <w:color w:val="1F2A37"/>
+                <w:sz w:val="18"/>
+                <w:szCs w:val="18"/>
+              </w:rPr>
+              <w:t xml:space="preserve">Matched</w:t>
+            </w:r>
+          </w:p>
+        </w:tc>
+        <w:tc>
+          <w:tcPr>
+            <w:tcW w:type="dxa" w:w="2866"/>
+            <w:tcBorders>
+              <w:top w:val="single" w:color="C9D1D9" w:sz="4"/>
+              <w:left w:val="single" w:color="C9D1D9" w:sz="4"/>
+              <w:bottom w:val="single" w:color="C9D1D9" w:sz="4"/>
+              <w:right w:val="single" w:color="C9D1D9" w:sz="4"/>
+            </w:tcBorders>
+            <w:shd w:fill="D9F0DF" w:color="auto" w:val="clear"/>
+            <w:tcMar>
+              <w:top w:type="dxa" w:w="60"/>
+              <w:left w:type="dxa" w:w="90"/>
+              <w:bottom w:type="dxa" w:w="60"/>
+              <w:right w:type="dxa" w:w="90"/>
+            </w:tcMar>
+            <w:vAlign w:val="top"/>
+          </w:tcPr>
+          <w:p>
+            <w:pPr>
+              <w:spacing w:after="20"/>
+            </w:pPr>
+            <w:r>
+              <w:rPr>
+                <w:rFonts w:ascii="Calibri" w:cs="Calibri" w:eastAsia="Calibri" w:hAnsi="Calibri"/>
+                <w:color w:val="1F2A37"/>
+                <w:sz w:val="18"/>
+                <w:szCs w:val="18"/>
+              </w:rPr>
+              <w:t xml:space="preserve">Unchanged, matched</w:t>
+            </w:r>
+          </w:p>
+        </w:tc>
+      </w:tr>
+      <w:tr>
+        <w:trPr>
+          <w:cantSplit/>
+        </w:trPr>
+        <w:tc>
+          <w:tcPr>
+            <w:tcW w:type="dxa" w:w="2300"/>
+            <w:tcBorders>
+              <w:top w:val="single" w:color="C9D1D9" w:sz="4"/>
+              <w:left w:val="single" w:color="C9D1D9" w:sz="4"/>
+              <w:bottom w:val="single" w:color="C9D1D9" w:sz="4"/>
+              <w:right w:val="single" w:color="C9D1D9" w:sz="4"/>
+            </w:tcBorders>
+            <w:tcMar>
+              <w:top w:type="dxa" w:w="60"/>
+              <w:left w:type="dxa" w:w="90"/>
+              <w:bottom w:type="dxa" w:w="60"/>
+              <w:right w:type="dxa" w:w="90"/>
+            </w:tcMar>
+            <w:vAlign w:val="top"/>
+          </w:tcPr>
+          <w:p>
+            <w:pPr>
+              <w:spacing w:after="20"/>
+            </w:pPr>
+            <w:r>
+              <w:rPr>
+                <w:rFonts w:ascii="Calibri" w:cs="Calibri" w:eastAsia="Calibri" w:hAnsi="Calibri"/>
+                <w:color w:val="1F2A37"/>
+                <w:sz w:val="18"/>
+                <w:szCs w:val="18"/>
+              </w:rPr>
+              <w:t xml:space="preserve">Number of authors</w:t>
+            </w:r>
+          </w:p>
+        </w:tc>
+        <w:tc>
+          <w:tcPr>
+            <w:tcW w:type="dxa" w:w="3000"/>
+            <w:tcBorders>
+              <w:top w:val="single" w:color="C9D1D9" w:sz="4"/>
+              <w:left w:val="single" w:color="C9D1D9" w:sz="4"/>
+              <w:bottom w:val="single" w:color="C9D1D9" w:sz="4"/>
+              <w:right w:val="single" w:color="C9D1D9" w:sz="4"/>
+            </w:tcBorders>
+            <w:tcMar>
+              <w:top w:type="dxa" w:w="60"/>
+              <w:left w:type="dxa" w:w="90"/>
+              <w:bottom w:type="dxa" w:w="60"/>
+              <w:right w:type="dxa" w:w="90"/>
+            </w:tcMar>
+            <w:vAlign w:val="top"/>
+          </w:tcPr>
+          <w:p>
+            <w:pPr>
+              <w:spacing w:after="20"/>
+            </w:pPr>
+            <w:r>
+              <w:rPr>
+                <w:rFonts w:ascii="Calibri" w:cs="Calibri" w:eastAsia="Calibri" w:hAnsi="Calibri"/>
+                <w:color w:val="1F2A37"/>
+                <w:sz w:val="18"/>
+                <w:szCs w:val="18"/>
+              </w:rPr>
+              <w:t xml:space="preserve">"Names and initials of all authors"</w:t>
+            </w:r>
+          </w:p>
+        </w:tc>
+        <w:tc>
+          <w:tcPr>
+            <w:tcW w:type="dxa" w:w="2300"/>
+            <w:tcBorders>
+              <w:top w:val="single" w:color="C9D1D9" w:sz="4"/>
+              <w:left w:val="single" w:color="C9D1D9" w:sz="4"/>
+              <w:bottom w:val="single" w:color="C9D1D9" w:sz="4"/>
+              <w:right w:val="single" w:color="C9D1D9" w:sz="4"/>
+            </w:tcBorders>
+            <w:shd w:fill="F9D4D4" w:color="auto" w:val="clear"/>
+            <w:tcMar>
+              <w:top w:type="dxa" w:w="60"/>
+              <w:left w:type="dxa" w:w="90"/>
+              <w:bottom w:type="dxa" w:w="60"/>
+              <w:right w:type="dxa" w:w="90"/>
+            </w:tcMar>
+            <w:vAlign w:val="top"/>
+          </w:tcPr>
+          <w:p>
+            <w:pPr>
+              <w:spacing w:after="20"/>
+            </w:pPr>
+            <w:r>
+              <w:rPr>
+                <w:rFonts w:ascii="Calibri" w:cs="Calibri" w:eastAsia="Calibri" w:hAnsi="Calibri"/>
+                <w:color w:val="1F2A37"/>
+                <w:sz w:val="18"/>
+                <w:szCs w:val="18"/>
+              </w:rPr>
+              <w:t xml:space="preserve">Cut at 6 with et al.; full lists of 7+ flagged</w:t>
+            </w:r>
+          </w:p>
+        </w:tc>
+        <w:tc>
+          <w:tcPr>
+            <w:tcW w:type="dxa" w:w="2866"/>
+            <w:tcBorders>
+              <w:top w:val="single" w:color="C9D1D9" w:sz="4"/>
+              <w:left w:val="single" w:color="C9D1D9" w:sz="4"/>
+              <w:bottom w:val="single" w:color="C9D1D9" w:sz="4"/>
+              <w:right w:val="single" w:color="C9D1D9" w:sz="4"/>
+            </w:tcBorders>
+            <w:shd w:fill="D9F0DF" w:color="auto" w:val="clear"/>
+            <w:tcMar>
+              <w:top w:type="dxa" w:w="60"/>
+              <w:left w:type="dxa" w:w="90"/>
+              <w:bottom w:type="dxa" w:w="60"/>
+              <w:right w:type="dxa" w:w="90"/>
+            </w:tcMar>
+            <w:vAlign w:val="top"/>
+          </w:tcPr>
+          <w:p>
+            <w:pPr>
+              <w:spacing w:after="20"/>
+            </w:pPr>
+            <w:r>
+              <w:rPr>
+                <w:rFonts w:ascii="Calibri" w:cs="Calibri" w:eastAsia="Calibri" w:hAnsi="Calibri"/>
+                <w:color w:val="1F2A37"/>
+                <w:sz w:val="18"/>
+                <w:szCs w:val="18"/>
+              </w:rPr>
+              <w:t xml:space="preserve">All authors kept; "et al." in the list is flagged</w:t>
+            </w:r>
+          </w:p>
+        </w:tc>
+      </w:tr>
+      <w:tr>
+        <w:trPr>
+          <w:cantSplit/>
+        </w:trPr>
+        <w:tc>
+          <w:tcPr>
+            <w:tcW w:type="dxa" w:w="2300"/>
+            <w:tcBorders>
+              <w:top w:val="single" w:color="C9D1D9" w:sz="4"/>
+              <w:left w:val="single" w:color="C9D1D9" w:sz="4"/>
+              <w:bottom w:val="single" w:color="C9D1D9" w:sz="4"/>
+              <w:right w:val="single" w:color="C9D1D9" w:sz="4"/>
+            </w:tcBorders>
+            <w:tcMar>
+              <w:top w:type="dxa" w:w="60"/>
+              <w:left w:type="dxa" w:w="90"/>
+              <w:bottom w:type="dxa" w:w="60"/>
+              <w:right w:type="dxa" w:w="90"/>
+            </w:tcMar>
+            <w:vAlign w:val="top"/>
+          </w:tcPr>
+          <w:p>
+            <w:pPr>
+              <w:spacing w:after="20"/>
+            </w:pPr>
+            <w:r>
+              <w:rPr>
+                <w:rFonts w:ascii="Calibri" w:cs="Calibri" w:eastAsia="Calibri" w:hAnsi="Calibri"/>
+                <w:color w:val="1F2A37"/>
+                <w:sz w:val="18"/>
+                <w:szCs w:val="18"/>
+              </w:rPr>
+              <w:t xml:space="preserve">Journal / volume formatting</w:t>
+            </w:r>
+          </w:p>
+        </w:tc>
+        <w:tc>
+          <w:tcPr>
+            <w:tcW w:type="dxa" w:w="3000"/>
+            <w:tcBorders>
+              <w:top w:val="single" w:color="C9D1D9" w:sz="4"/>
+              <w:left w:val="single" w:color="C9D1D9" w:sz="4"/>
+              <w:bottom w:val="single" w:color="C9D1D9" w:sz="4"/>
+              <w:right w:val="single" w:color="C9D1D9" w:sz="4"/>
+            </w:tcBorders>
+            <w:tcMar>
+              <w:top w:type="dxa" w:w="60"/>
+              <w:left w:type="dxa" w:w="90"/>
+              <w:bottom w:type="dxa" w:w="60"/>
+              <w:right w:type="dxa" w:w="90"/>
+            </w:tcMar>
+            <w:vAlign w:val="top"/>
+          </w:tcPr>
+          <w:p>
+            <w:pPr>
+              <w:spacing w:after="20"/>
+            </w:pPr>
+            <w:r>
+              <w:rPr>
+                <w:rFonts w:ascii="Calibri" w:cs="Calibri" w:eastAsia="Calibri" w:hAnsi="Calibri"/>
+                <w:color w:val="1F2A37"/>
+                <w:sz w:val="18"/>
+                <w:szCs w:val="18"/>
+              </w:rPr>
+              <w:t xml:space="preserve">Abbreviated journal in italics, volume in bold</w:t>
+            </w:r>
+          </w:p>
+        </w:tc>
+        <w:tc>
+          <w:tcPr>
+            <w:tcW w:type="dxa" w:w="2300"/>
+            <w:tcBorders>
+              <w:top w:val="single" w:color="C9D1D9" w:sz="4"/>
+              <w:left w:val="single" w:color="C9D1D9" w:sz="4"/>
+              <w:bottom w:val="single" w:color="C9D1D9" w:sz="4"/>
+              <w:right w:val="single" w:color="C9D1D9" w:sz="4"/>
+            </w:tcBorders>
+            <w:shd w:fill="FFF0C2" w:color="auto" w:val="clear"/>
+            <w:tcMar>
+              <w:top w:type="dxa" w:w="60"/>
+              <w:left w:type="dxa" w:w="90"/>
+              <w:bottom w:type="dxa" w:w="60"/>
+              <w:right w:type="dxa" w:w="90"/>
+            </w:tcMar>
+            <w:vAlign w:val="top"/>
+          </w:tcPr>
+          <w:p>
+            <w:pPr>
+              <w:spacing w:after="20"/>
+            </w:pPr>
+            <w:r>
+              <w:rPr>
+                <w:rFonts w:ascii="Calibri" w:cs="Calibri" w:eastAsia="Calibri" w:hAnsi="Calibri"/>
+                <w:color w:val="1F2A37"/>
+                <w:sz w:val="18"/>
+                <w:szCs w:val="18"/>
+              </w:rPr>
+              <w:t xml:space="preserve">Italic only in some styles</w:t>
+            </w:r>
+          </w:p>
+        </w:tc>
+        <w:tc>
+          <w:tcPr>
+            <w:tcW w:type="dxa" w:w="2866"/>
+            <w:tcBorders>
+              <w:top w:val="single" w:color="C9D1D9" w:sz="4"/>
+              <w:left w:val="single" w:color="C9D1D9" w:sz="4"/>
+              <w:bottom w:val="single" w:color="C9D1D9" w:sz="4"/>
+              <w:right w:val="single" w:color="C9D1D9" w:sz="4"/>
+            </w:tcBorders>
+            <w:shd w:fill="D9F0DF" w:color="auto" w:val="clear"/>
+            <w:tcMar>
+              <w:top w:type="dxa" w:w="60"/>
+              <w:left w:type="dxa" w:w="90"/>
+              <w:bottom w:type="dxa" w:w="60"/>
+              <w:right w:type="dxa" w:w="90"/>
+            </w:tcMar>
+            <w:vAlign w:val="top"/>
+          </w:tcPr>
+          <w:p>
+            <w:pPr>
+              <w:spacing w:after="20"/>
+            </w:pPr>
+            <w:r>
+              <w:rPr>
+                <w:rFonts w:ascii="Calibri" w:cs="Calibri" w:eastAsia="Calibri" w:hAnsi="Calibri"/>
+                <w:color w:val="1F2A37"/>
+                <w:sz w:val="18"/>
+                <w:szCs w:val="18"/>
+              </w:rPr>
+              <w:t xml:space="preserve">Italic journal, bold volume (tested)</w:t>
+            </w:r>
+          </w:p>
+        </w:tc>
+      </w:tr>
+      <w:tr>
+        <w:trPr>
+          <w:cantSplit/>
+        </w:trPr>
+        <w:tc>
+          <w:tcPr>
+            <w:tcW w:type="dxa" w:w="2300"/>
+            <w:tcBorders>
+              <w:top w:val="single" w:color="C9D1D9" w:sz="4"/>
+              <w:left w:val="single" w:color="C9D1D9" w:sz="4"/>
+              <w:bottom w:val="single" w:color="C9D1D9" w:sz="4"/>
+              <w:right w:val="single" w:color="C9D1D9" w:sz="4"/>
+            </w:tcBorders>
+            <w:tcMar>
+              <w:top w:type="dxa" w:w="60"/>
+              <w:left w:type="dxa" w:w="90"/>
+              <w:bottom w:type="dxa" w:w="60"/>
+              <w:right w:type="dxa" w:w="90"/>
+            </w:tcMar>
+            <w:vAlign w:val="top"/>
+          </w:tcPr>
+          <w:p>
+            <w:pPr>
+              <w:spacing w:after="20"/>
+            </w:pPr>
+            <w:r>
+              <w:rPr>
+                <w:rFonts w:ascii="Calibri" w:cs="Calibri" w:eastAsia="Calibri" w:hAnsi="Calibri"/>
+                <w:color w:val="1F2A37"/>
+                <w:sz w:val="18"/>
+                <w:szCs w:val="18"/>
+              </w:rPr>
+              <w:t xml:space="preserve">Journal example</w:t>
+            </w:r>
+          </w:p>
+        </w:tc>
+        <w:tc>
+          <w:tcPr>
+            <w:tcW w:type="dxa" w:w="3000"/>
+            <w:tcBorders>
+              <w:top w:val="single" w:color="C9D1D9" w:sz="4"/>
+              <w:left w:val="single" w:color="C9D1D9" w:sz="4"/>
+              <w:bottom w:val="single" w:color="C9D1D9" w:sz="4"/>
+              <w:right w:val="single" w:color="C9D1D9" w:sz="4"/>
+            </w:tcBorders>
+            <w:tcMar>
+              <w:top w:type="dxa" w:w="60"/>
+              <w:left w:type="dxa" w:w="90"/>
+              <w:bottom w:type="dxa" w:w="60"/>
+              <w:right w:type="dxa" w:w="90"/>
+            </w:tcMar>
+            <w:vAlign w:val="top"/>
+          </w:tcPr>
+          <w:p>
+            <w:pPr>
+              <w:spacing w:after="20"/>
+            </w:pPr>
+            <w:r>
+              <w:rPr>
+                <w:rFonts w:ascii="Calibri" w:cs="Calibri" w:eastAsia="Calibri" w:hAnsi="Calibri"/>
+                <w:color w:val="1F2A37"/>
+                <w:sz w:val="18"/>
+                <w:szCs w:val="18"/>
+              </w:rPr>
+              <w:t xml:space="preserve">Yoneto K, … (1996). … J. Pharm. Sci., 85(5): 511-517.</w:t>
+            </w:r>
+          </w:p>
+        </w:tc>
+        <w:tc>
+          <w:tcPr>
+            <w:tcW w:type="dxa" w:w="2300"/>
+            <w:tcBorders>
+              <w:top w:val="single" w:color="C9D1D9" w:sz="4"/>
+              <w:left w:val="single" w:color="C9D1D9" w:sz="4"/>
+              <w:bottom w:val="single" w:color="C9D1D9" w:sz="4"/>
+              <w:right w:val="single" w:color="C9D1D9" w:sz="4"/>
+            </w:tcBorders>
+            <w:shd w:fill="D9F0DF" w:color="auto" w:val="clear"/>
+            <w:tcMar>
+              <w:top w:type="dxa" w:w="60"/>
+              <w:left w:type="dxa" w:w="90"/>
+              <w:bottom w:type="dxa" w:w="60"/>
+              <w:right w:type="dxa" w:w="90"/>
+            </w:tcMar>
+            <w:vAlign w:val="top"/>
+          </w:tcPr>
+          <w:p>
+            <w:pPr>
+              <w:spacing w:after="20"/>
+            </w:pPr>
+            <w:r>
+              <w:rPr>
+                <w:rFonts w:ascii="Calibri" w:cs="Calibri" w:eastAsia="Calibri" w:hAnsi="Calibri"/>
+                <w:color w:val="1F2A37"/>
+                <w:sz w:val="18"/>
+                <w:szCs w:val="18"/>
+              </w:rPr>
+              <w:t xml:space="preserve">Matched</w:t>
+            </w:r>
+          </w:p>
+        </w:tc>
+        <w:tc>
+          <w:tcPr>
+            <w:tcW w:type="dxa" w:w="2866"/>
+            <w:tcBorders>
+              <w:top w:val="single" w:color="C9D1D9" w:sz="4"/>
+              <w:left w:val="single" w:color="C9D1D9" w:sz="4"/>
+              <w:bottom w:val="single" w:color="C9D1D9" w:sz="4"/>
+              <w:right w:val="single" w:color="C9D1D9" w:sz="4"/>
+            </w:tcBorders>
+            <w:shd w:fill="D9F0DF" w:color="auto" w:val="clear"/>
+            <w:tcMar>
+              <w:top w:type="dxa" w:w="60"/>
+              <w:left w:type="dxa" w:w="90"/>
+              <w:bottom w:type="dxa" w:w="60"/>
+              <w:right w:type="dxa" w:w="90"/>
+            </w:tcMar>
+            <w:vAlign w:val="top"/>
+          </w:tcPr>
+          <w:p>
+            <w:pPr>
+              <w:spacing w:after="20"/>
+            </w:pPr>
+            <w:r>
+              <w:rPr>
+                <w:rFonts w:ascii="Calibri" w:cs="Calibri" w:eastAsia="Calibri" w:hAnsi="Calibri"/>
+                <w:color w:val="1F2A37"/>
+                <w:sz w:val="18"/>
+                <w:szCs w:val="18"/>
+              </w:rPr>
+              <w:t xml:space="preserve">Exact match (tested)</w:t>
+            </w:r>
+          </w:p>
+        </w:tc>
+      </w:tr>
+      <w:tr>
+        <w:trPr>
+          <w:cantSplit/>
+        </w:trPr>
+        <w:tc>
+          <w:tcPr>
+            <w:tcW w:type="dxa" w:w="2300"/>
+            <w:tcBorders>
+              <w:top w:val="single" w:color="C9D1D9" w:sz="4"/>
+              <w:left w:val="single" w:color="C9D1D9" w:sz="4"/>
+              <w:bottom w:val="single" w:color="C9D1D9" w:sz="4"/>
+              <w:right w:val="single" w:color="C9D1D9" w:sz="4"/>
+            </w:tcBorders>
+            <w:tcMar>
+              <w:top w:type="dxa" w:w="60"/>
+              <w:left w:type="dxa" w:w="90"/>
+              <w:bottom w:type="dxa" w:w="60"/>
+              <w:right w:type="dxa" w:w="90"/>
+            </w:tcMar>
+            <w:vAlign w:val="top"/>
+          </w:tcPr>
+          <w:p>
+            <w:pPr>
+              <w:spacing w:after="20"/>
+            </w:pPr>
+            <w:r>
+              <w:rPr>
+                <w:rFonts w:ascii="Calibri" w:cs="Calibri" w:eastAsia="Calibri" w:hAnsi="Calibri"/>
+                <w:color w:val="1F2A37"/>
+                <w:sz w:val="18"/>
+                <w:szCs w:val="18"/>
+              </w:rPr>
+              <w:t xml:space="preserve">Edited-book chapter</w:t>
+            </w:r>
+          </w:p>
+        </w:tc>
+        <w:tc>
+          <w:tcPr>
+            <w:tcW w:type="dxa" w:w="3000"/>
+            <w:tcBorders>
+              <w:top w:val="single" w:color="C9D1D9" w:sz="4"/>
+              <w:left w:val="single" w:color="C9D1D9" w:sz="4"/>
+              <w:bottom w:val="single" w:color="C9D1D9" w:sz="4"/>
+              <w:right w:val="single" w:color="C9D1D9" w:sz="4"/>
+            </w:tcBorders>
+            <w:tcMar>
+              <w:top w:type="dxa" w:w="60"/>
+              <w:left w:type="dxa" w:w="90"/>
+              <w:bottom w:type="dxa" w:w="60"/>
+              <w:right w:type="dxa" w:w="90"/>
+            </w:tcMar>
+            <w:vAlign w:val="top"/>
+          </w:tcPr>
+          <w:p>
+            <w:pPr>
+              <w:spacing w:after="20"/>
+            </w:pPr>
+            <w:r>
+              <w:rPr>
+                <w:rFonts w:ascii="Calibri" w:cs="Calibri" w:eastAsia="Calibri" w:hAnsi="Calibri"/>
+                <w:color w:val="1F2A37"/>
+                <w:sz w:val="18"/>
+                <w:szCs w:val="18"/>
+              </w:rPr>
+              <w:t xml:space="preserve">In: Editors (eds.), Book, 7th ed., Publisher, Place, pp. 446-472</w:t>
+            </w:r>
+          </w:p>
+        </w:tc>
+        <w:tc>
+          <w:tcPr>
+            <w:tcW w:type="dxa" w:w="2300"/>
+            <w:tcBorders>
+              <w:top w:val="single" w:color="C9D1D9" w:sz="4"/>
+              <w:left w:val="single" w:color="C9D1D9" w:sz="4"/>
+              <w:bottom w:val="single" w:color="C9D1D9" w:sz="4"/>
+              <w:right w:val="single" w:color="C9D1D9" w:sz="4"/>
+            </w:tcBorders>
+            <w:shd w:fill="F9D4D4" w:color="auto" w:val="clear"/>
+            <w:tcMar>
+              <w:top w:type="dxa" w:w="60"/>
+              <w:left w:type="dxa" w:w="90"/>
+              <w:bottom w:type="dxa" w:w="60"/>
+              <w:right w:type="dxa" w:w="90"/>
+            </w:tcMar>
+            <w:vAlign w:val="top"/>
+          </w:tcPr>
+          <w:p>
+            <w:pPr>
+              <w:spacing w:after="20"/>
+            </w:pPr>
+            <w:r>
+              <w:rPr>
+                <w:rFonts w:ascii="Calibri" w:cs="Calibri" w:eastAsia="Calibri" w:hAnsi="Calibri"/>
+                <w:color w:val="1F2A37"/>
+                <w:sz w:val="18"/>
+                <w:szCs w:val="18"/>
+              </w:rPr>
+              <w:t xml:space="preserve">No format; "pp." flagged</w:t>
+            </w:r>
+          </w:p>
+        </w:tc>
+        <w:tc>
+          <w:tcPr>
+            <w:tcW w:type="dxa" w:w="2866"/>
+            <w:tcBorders>
+              <w:top w:val="single" w:color="C9D1D9" w:sz="4"/>
+              <w:left w:val="single" w:color="C9D1D9" w:sz="4"/>
+              <w:bottom w:val="single" w:color="C9D1D9" w:sz="4"/>
+              <w:right w:val="single" w:color="C9D1D9" w:sz="4"/>
+            </w:tcBorders>
+            <w:shd w:fill="D9F0DF" w:color="auto" w:val="clear"/>
+            <w:tcMar>
+              <w:top w:type="dxa" w:w="60"/>
+              <w:left w:type="dxa" w:w="90"/>
+              <w:bottom w:type="dxa" w:w="60"/>
+              <w:right w:type="dxa" w:w="90"/>
+            </w:tcMar>
+            <w:vAlign w:val="top"/>
+          </w:tcPr>
+          <w:p>
+            <w:pPr>
+              <w:spacing w:after="20"/>
+            </w:pPr>
+            <w:r>
+              <w:rPr>
+                <w:rFonts w:ascii="Calibri" w:cs="Calibri" w:eastAsia="Calibri" w:hAnsi="Calibri"/>
+                <w:color w:val="1F2A37"/>
+                <w:sz w:val="18"/>
+                <w:szCs w:val="18"/>
+              </w:rPr>
+              <w:t xml:space="preserve">Read, written and checked; exact match (tested)</w:t>
+            </w:r>
+          </w:p>
+        </w:tc>
+      </w:tr>
+      <w:tr>
+        <w:trPr>
+          <w:cantSplit/>
+        </w:trPr>
+        <w:tc>
+          <w:tcPr>
+            <w:tcW w:type="dxa" w:w="2300"/>
+            <w:tcBorders>
+              <w:top w:val="single" w:color="C9D1D9" w:sz="4"/>
+              <w:left w:val="single" w:color="C9D1D9" w:sz="4"/>
+              <w:bottom w:val="single" w:color="C9D1D9" w:sz="4"/>
+              <w:right w:val="single" w:color="C9D1D9" w:sz="4"/>
+            </w:tcBorders>
+            <w:tcMar>
+              <w:top w:type="dxa" w:w="60"/>
+              <w:left w:type="dxa" w:w="90"/>
+              <w:bottom w:type="dxa" w:w="60"/>
+              <w:right w:type="dxa" w:w="90"/>
+            </w:tcMar>
+            <w:vAlign w:val="top"/>
+          </w:tcPr>
+          <w:p>
+            <w:pPr>
+              <w:spacing w:after="20"/>
+            </w:pPr>
+            <w:r>
+              <w:rPr>
+                <w:rFonts w:ascii="Calibri" w:cs="Calibri" w:eastAsia="Calibri" w:hAnsi="Calibri"/>
+                <w:color w:val="1F2A37"/>
+                <w:sz w:val="18"/>
+                <w:szCs w:val="18"/>
+              </w:rPr>
+              <w:t xml:space="preserve">Website</w:t>
+            </w:r>
+          </w:p>
+        </w:tc>
+        <w:tc>
+          <w:tcPr>
+            <w:tcW w:type="dxa" w:w="3000"/>
+            <w:tcBorders>
+              <w:top w:val="single" w:color="C9D1D9" w:sz="4"/>
+              <w:left w:val="single" w:color="C9D1D9" w:sz="4"/>
+              <w:bottom w:val="single" w:color="C9D1D9" w:sz="4"/>
+              <w:right w:val="single" w:color="C9D1D9" w:sz="4"/>
+            </w:tcBorders>
+            <w:tcMar>
+              <w:top w:type="dxa" w:w="60"/>
+              <w:left w:type="dxa" w:w="90"/>
+              <w:bottom w:type="dxa" w:w="60"/>
+              <w:right w:type="dxa" w:w="90"/>
+            </w:tcMar>
+            <w:vAlign w:val="top"/>
+          </w:tcPr>
+          <w:p>
+            <w:pPr>
+              <w:spacing w:after="20"/>
+            </w:pPr>
+            <w:r>
+              <w:rPr>
+                <w:rFonts w:ascii="Calibri" w:cs="Calibri" w:eastAsia="Calibri" w:hAnsi="Calibri"/>
+                <w:color w:val="1F2A37"/>
+                <w:sz w:val="18"/>
+                <w:szCs w:val="18"/>
+              </w:rPr>
+              <w:t xml:space="preserve">Available at: URL (Accessed 15 June 2020)</w:t>
+            </w:r>
+          </w:p>
+        </w:tc>
+        <w:tc>
+          <w:tcPr>
+            <w:tcW w:type="dxa" w:w="2300"/>
+            <w:tcBorders>
+              <w:top w:val="single" w:color="C9D1D9" w:sz="4"/>
+              <w:left w:val="single" w:color="C9D1D9" w:sz="4"/>
+              <w:bottom w:val="single" w:color="C9D1D9" w:sz="4"/>
+              <w:right w:val="single" w:color="C9D1D9" w:sz="4"/>
+            </w:tcBorders>
+            <w:shd w:fill="F9D4D4" w:color="auto" w:val="clear"/>
+            <w:tcMar>
+              <w:top w:type="dxa" w:w="60"/>
+              <w:left w:type="dxa" w:w="90"/>
+              <w:bottom w:type="dxa" w:w="60"/>
+              <w:right w:type="dxa" w:w="90"/>
+            </w:tcMar>
+            <w:vAlign w:val="top"/>
+          </w:tcPr>
+          <w:p>
+            <w:pPr>
+              <w:spacing w:after="20"/>
+            </w:pPr>
+            <w:r>
+              <w:rPr>
+                <w:rFonts w:ascii="Calibri" w:cs="Calibri" w:eastAsia="Calibri" w:hAnsi="Calibri"/>
+                <w:color w:val="1F2A37"/>
+                <w:sz w:val="18"/>
+                <w:szCs w:val="18"/>
+              </w:rPr>
+              <w:t xml:space="preserve">No format</w:t>
+            </w:r>
+          </w:p>
+        </w:tc>
+        <w:tc>
+          <w:tcPr>
+            <w:tcW w:type="dxa" w:w="2866"/>
+            <w:tcBorders>
+              <w:top w:val="single" w:color="C9D1D9" w:sz="4"/>
+              <w:left w:val="single" w:color="C9D1D9" w:sz="4"/>
+              <w:bottom w:val="single" w:color="C9D1D9" w:sz="4"/>
+              <w:right w:val="single" w:color="C9D1D9" w:sz="4"/>
+            </w:tcBorders>
+            <w:shd w:fill="D9F0DF" w:color="auto" w:val="clear"/>
+            <w:tcMar>
+              <w:top w:type="dxa" w:w="60"/>
+              <w:left w:type="dxa" w:w="90"/>
+              <w:bottom w:type="dxa" w:w="60"/>
+              <w:right w:type="dxa" w:w="90"/>
+            </w:tcMar>
+            <w:vAlign w:val="top"/>
+          </w:tcPr>
+          <w:p>
+            <w:pPr>
+              <w:spacing w:after="20"/>
+            </w:pPr>
+            <w:r>
+              <w:rPr>
+                <w:rFonts w:ascii="Calibri" w:cs="Calibri" w:eastAsia="Calibri" w:hAnsi="Calibri"/>
+                <w:color w:val="1F2A37"/>
+                <w:sz w:val="18"/>
+                <w:szCs w:val="18"/>
+              </w:rPr>
+              <w:t xml:space="preserve">Read, written and checked; matches except one space (tested)</w:t>
+            </w:r>
+          </w:p>
+        </w:tc>
+      </w:tr>
+      <w:tr>
+        <w:trPr>
+          <w:cantSplit/>
+        </w:trPr>
+        <w:tc>
+          <w:tcPr>
+            <w:tcW w:type="dxa" w:w="2300"/>
+            <w:tcBorders>
+              <w:top w:val="single" w:color="C9D1D9" w:sz="4"/>
+              <w:left w:val="single" w:color="C9D1D9" w:sz="4"/>
+              <w:bottom w:val="single" w:color="C9D1D9" w:sz="4"/>
+              <w:right w:val="single" w:color="C9D1D9" w:sz="4"/>
+            </w:tcBorders>
+            <w:tcMar>
+              <w:top w:type="dxa" w:w="60"/>
+              <w:left w:type="dxa" w:w="90"/>
+              <w:bottom w:type="dxa" w:w="60"/>
+              <w:right w:type="dxa" w:w="90"/>
+            </w:tcMar>
+            <w:vAlign w:val="top"/>
+          </w:tcPr>
+          <w:p>
+            <w:pPr>
+              <w:spacing w:after="20"/>
+            </w:pPr>
+            <w:r>
+              <w:rPr>
+                <w:rFonts w:ascii="Calibri" w:cs="Calibri" w:eastAsia="Calibri" w:hAnsi="Calibri"/>
+                <w:color w:val="1F2A37"/>
+                <w:sz w:val="18"/>
+                <w:szCs w:val="18"/>
+              </w:rPr>
+              <w:t xml:space="preserve">DOI</w:t>
+            </w:r>
+          </w:p>
+        </w:tc>
+        <w:tc>
+          <w:tcPr>
+            <w:tcW w:type="dxa" w:w="3000"/>
+            <w:tcBorders>
+              <w:top w:val="single" w:color="C9D1D9" w:sz="4"/>
+              <w:left w:val="single" w:color="C9D1D9" w:sz="4"/>
+              <w:bottom w:val="single" w:color="C9D1D9" w:sz="4"/>
+              <w:right w:val="single" w:color="C9D1D9" w:sz="4"/>
+            </w:tcBorders>
+            <w:tcMar>
+              <w:top w:type="dxa" w:w="60"/>
+              <w:left w:type="dxa" w:w="90"/>
+              <w:bottom w:type="dxa" w:w="60"/>
+              <w:right w:type="dxa" w:w="90"/>
+            </w:tcMar>
+            <w:vAlign w:val="top"/>
+          </w:tcPr>
+          <w:p>
+            <w:pPr>
+              <w:spacing w:after="20"/>
+            </w:pPr>
+            <w:r>
+              <w:rPr>
+                <w:rFonts w:ascii="Calibri" w:cs="Calibri" w:eastAsia="Calibri" w:hAnsi="Calibri"/>
+                <w:color w:val="1F2A37"/>
+                <w:sz w:val="18"/>
+                <w:szCs w:val="18"/>
+              </w:rPr>
+              <w:t xml:space="preserve">Not mentioned</w:t>
+            </w:r>
+          </w:p>
+        </w:tc>
+        <w:tc>
+          <w:tcPr>
+            <w:tcW w:type="dxa" w:w="2300"/>
+            <w:tcBorders>
+              <w:top w:val="single" w:color="C9D1D9" w:sz="4"/>
+              <w:left w:val="single" w:color="C9D1D9" w:sz="4"/>
+              <w:bottom w:val="single" w:color="C9D1D9" w:sz="4"/>
+              <w:right w:val="single" w:color="C9D1D9" w:sz="4"/>
+            </w:tcBorders>
+            <w:shd w:fill="FFF0C2" w:color="auto" w:val="clear"/>
+            <w:tcMar>
+              <w:top w:type="dxa" w:w="60"/>
+              <w:left w:type="dxa" w:w="90"/>
+              <w:bottom w:type="dxa" w:w="60"/>
+              <w:right w:type="dxa" w:w="90"/>
+            </w:tcMar>
+            <w:vAlign w:val="top"/>
+          </w:tcPr>
+          <w:p>
+            <w:pPr>
+              <w:spacing w:after="20"/>
+            </w:pPr>
+            <w:r>
+              <w:rPr>
+                <w:rFonts w:ascii="Calibri" w:cs="Calibri" w:eastAsia="Calibri" w:hAnsi="Calibri"/>
+                <w:color w:val="1F2A37"/>
+                <w:sz w:val="18"/>
+                <w:szCs w:val="18"/>
+              </w:rPr>
+              <w:t xml:space="preserve">Added to every article</w:t>
+            </w:r>
+          </w:p>
+        </w:tc>
+        <w:tc>
+          <w:tcPr>
+            <w:tcW w:type="dxa" w:w="2866"/>
+            <w:tcBorders>
+              <w:top w:val="single" w:color="C9D1D9" w:sz="4"/>
+              <w:left w:val="single" w:color="C9D1D9" w:sz="4"/>
+              <w:bottom w:val="single" w:color="C9D1D9" w:sz="4"/>
+              <w:right w:val="single" w:color="C9D1D9" w:sz="4"/>
+            </w:tcBorders>
+            <w:shd w:fill="D9F0DF" w:color="auto" w:val="clear"/>
+            <w:tcMar>
+              <w:top w:type="dxa" w:w="60"/>
+              <w:left w:type="dxa" w:w="90"/>
+              <w:bottom w:type="dxa" w:w="60"/>
+              <w:right w:type="dxa" w:w="90"/>
+            </w:tcMar>
+            <w:vAlign w:val="top"/>
+          </w:tcPr>
+          <w:p>
+            <w:pPr>
+              <w:spacing w:after="20"/>
+            </w:pPr>
+            <w:r>
+              <w:rPr>
+                <w:rFonts w:ascii="Calibri" w:cs="Calibri" w:eastAsia="Calibri" w:hAnsi="Calibri"/>
+                <w:color w:val="1F2A37"/>
+                <w:sz w:val="18"/>
+                <w:szCs w:val="18"/>
+              </w:rPr>
+              <w:t xml:space="preserve">Not added; no DOI rule</w:t>
+            </w:r>
+          </w:p>
+        </w:tc>
+      </w:tr>
+      <w:tr>
+        <w:trPr>
+          <w:cantSplit/>
+        </w:trPr>
+        <w:tc>
+          <w:tcPr>
+            <w:tcW w:type="dxa" w:w="2300"/>
+            <w:tcBorders>
+              <w:top w:val="single" w:color="C9D1D9" w:sz="4"/>
+              <w:left w:val="single" w:color="C9D1D9" w:sz="4"/>
+              <w:bottom w:val="single" w:color="C9D1D9" w:sz="4"/>
+              <w:right w:val="single" w:color="C9D1D9" w:sz="4"/>
+            </w:tcBorders>
+            <w:tcMar>
+              <w:top w:type="dxa" w:w="60"/>
+              <w:left w:type="dxa" w:w="90"/>
+              <w:bottom w:type="dxa" w:w="60"/>
+              <w:right w:type="dxa" w:w="90"/>
+            </w:tcMar>
+            <w:vAlign w:val="top"/>
+          </w:tcPr>
+          <w:p>
+            <w:pPr>
+              <w:spacing w:after="20"/>
+            </w:pPr>
+            <w:r>
+              <w:rPr>
+                <w:rFonts w:ascii="Calibri" w:cs="Calibri" w:eastAsia="Calibri" w:hAnsi="Calibri"/>
+                <w:color w:val="1F2A37"/>
+                <w:sz w:val="18"/>
+                <w:szCs w:val="18"/>
+              </w:rPr>
+              <w:t xml:space="preserve">Other types (thesis, report, conference, software)</w:t>
+            </w:r>
+          </w:p>
+        </w:tc>
+        <w:tc>
+          <w:tcPr>
+            <w:tcW w:type="dxa" w:w="3000"/>
+            <w:tcBorders>
+              <w:top w:val="single" w:color="C9D1D9" w:sz="4"/>
+              <w:left w:val="single" w:color="C9D1D9" w:sz="4"/>
+              <w:bottom w:val="single" w:color="C9D1D9" w:sz="4"/>
+              <w:right w:val="single" w:color="C9D1D9" w:sz="4"/>
+            </w:tcBorders>
+            <w:tcMar>
+              <w:top w:type="dxa" w:w="60"/>
+              <w:left w:type="dxa" w:w="90"/>
+              <w:bottom w:type="dxa" w:w="60"/>
+              <w:right w:type="dxa" w:w="90"/>
+            </w:tcMar>
+            <w:vAlign w:val="top"/>
+          </w:tcPr>
+          <w:p>
+            <w:pPr>
+              <w:spacing w:after="20"/>
+            </w:pPr>
+            <w:r>
+              <w:rPr>
+                <w:rFonts w:ascii="Calibri" w:cs="Calibri" w:eastAsia="Calibri" w:hAnsi="Calibri"/>
+                <w:color w:val="1F2A37"/>
+                <w:sz w:val="18"/>
+                <w:szCs w:val="18"/>
+              </w:rPr>
+              <w:t xml:space="preserve">No example given</w:t>
+            </w:r>
+          </w:p>
+        </w:tc>
+        <w:tc>
+          <w:tcPr>
+            <w:tcW w:type="dxa" w:w="2300"/>
+            <w:tcBorders>
+              <w:top w:val="single" w:color="C9D1D9" w:sz="4"/>
+              <w:left w:val="single" w:color="C9D1D9" w:sz="4"/>
+              <w:bottom w:val="single" w:color="C9D1D9" w:sz="4"/>
+              <w:right w:val="single" w:color="C9D1D9" w:sz="4"/>
+            </w:tcBorders>
+            <w:shd w:fill="E5E7EB" w:color="auto" w:val="clear"/>
+            <w:tcMar>
+              <w:top w:type="dxa" w:w="60"/>
+              <w:left w:type="dxa" w:w="90"/>
+              <w:bottom w:type="dxa" w:w="60"/>
+              <w:right w:type="dxa" w:w="90"/>
+            </w:tcMar>
+            <w:vAlign w:val="top"/>
+          </w:tcPr>
+          <w:p>
+            <w:pPr>
+              <w:spacing w:after="20"/>
+            </w:pPr>
+            <w:r>
+              <w:rPr>
+                <w:rFonts w:ascii="Calibri" w:cs="Calibri" w:eastAsia="Calibri" w:hAnsi="Calibri"/>
+                <w:color w:val="1F2A37"/>
+                <w:sz w:val="18"/>
+                <w:szCs w:val="18"/>
+              </w:rPr>
+              <w:t xml:space="preserve">Book format</w:t>
+            </w:r>
+          </w:p>
+        </w:tc>
+        <w:tc>
+          <w:tcPr>
+            <w:tcW w:type="dxa" w:w="2866"/>
+            <w:tcBorders>
+              <w:top w:val="single" w:color="C9D1D9" w:sz="4"/>
+              <w:left w:val="single" w:color="C9D1D9" w:sz="4"/>
+              <w:bottom w:val="single" w:color="C9D1D9" w:sz="4"/>
+              <w:right w:val="single" w:color="C9D1D9" w:sz="4"/>
+            </w:tcBorders>
+            <w:shd w:fill="E5E7EB" w:color="auto" w:val="clear"/>
+            <w:tcMar>
+              <w:top w:type="dxa" w:w="60"/>
+              <w:left w:type="dxa" w:w="90"/>
+              <w:bottom w:type="dxa" w:w="60"/>
+              <w:right w:type="dxa" w:w="90"/>
+            </w:tcMar>
+            <w:vAlign w:val="top"/>
+          </w:tcPr>
+          <w:p>
+            <w:pPr>
+              <w:spacing w:after="20"/>
+            </w:pPr>
+            <w:r>
+              <w:rPr>
+                <w:rFonts w:ascii="Calibri" w:cs="Calibri" w:eastAsia="Calibri" w:hAnsi="Calibri"/>
+                <w:color w:val="1F2A37"/>
+                <w:sz w:val="18"/>
+                <w:szCs w:val="18"/>
+              </w:rPr>
+              <w:t xml:space="preserve">Book format; to confirm with the editor</w:t>
+            </w:r>
+          </w:p>
+        </w:tc>
+      </w:tr>
+    </w:tbl>
+    <w:p>
+      <w:pPr>
+        <w:spacing w:after="80" w:line="288"/>
+      </w:pPr>
+      <w:r>
+        <w:rPr>
+          <w:rFonts w:ascii="Calibri" w:cs="Calibri" w:eastAsia="Calibri" w:hAnsi="Calibri"/>
+          <w:color w:val="1F2A37"/>
+          <w:sz w:val="21"/>
+          <w:szCs w:val="21"/>
+        </w:rPr>
+        <w:t xml:space="preserve">Result: npm test passes including the new test/pjps-style.js (3 official examples, an 8-author list, italic and bold, and two deviations that must be flagged); the Module 2 audit again finds 14 of 14 planted rule breaks. One audit test case was changed on purpose: a correctly written 8-author reference was expected to be flagged under the old 6-author rule and is now correctly accepted.</w:t>
+      </w:r>
+    </w:p>
+    <w:p>
+      <w:pPr>
+        <w:spacing w:after="120" w:line="288"/>
+      </w:pPr>
+      <w:r>
+        <w:rPr>
+          <w:rFonts w:ascii="Calibri" w:cs="Calibri" w:eastAsia="Calibri" w:hAnsi="Calibri"/>
+          <w:i/>
+          <w:iCs/>
+          <w:color w:val="5B6675"/>
+          <w:sz w:val="21"/>
+          <w:szCs w:val="21"/>
+        </w:rPr>
+        <w:t xml:space="preserve">Not re-run after this change: Modules 1, 3, 4, 5 and the Full Screening Report. The change touched only the style engine, the reference parser (chapters, websites) and the compliance check, so a regression in Module 1 matching is possible but unlikely; re-run the audit scripts once on the final code (Phase A).</w:t>
+      </w:r>
+    </w:p>
+    <w:p>
+      <w:pPr>
         <w:pStyle w:val="Heading1"/>
         <w:pageBreakBefore/>
         <w:spacing w:after="200" w:before="0"/>
@@ -23860,7 +25330,7 @@
                 <w:sz w:val="18"/>
                 <w:szCs w:val="18"/>
               </w:rPr>
-              <w:t xml:space="preserve">Three source files (reference.js, datasets.js, core.js) carry uncommitted changes that hold the fixes for D6/D7/D20 and a bad-file message. The audit ran on that working copy, not on the last commit. The browser screens still have no automated test.</w:t>
+              <w:t xml:space="preserve">RESOLVED 26 Oct: three source files (reference.js, datasets.js, core.js) carried uncommitted fixes for D6/D7/D20 and a bad-file message while the audit ran; they were committed and pushed (549eb68). The browser screens still have no automated test.</w:t>
             </w:r>
           </w:p>
         </w:tc>
@@ -23892,7 +25362,173 @@
                 <w:sz w:val="18"/>
                 <w:szCs w:val="18"/>
               </w:rPr>
-              <w:t xml:space="preserve">Commit, then add one browser test per module screen.</w:t>
+              <w:t xml:space="preserve">Add one browser test per module screen.</w:t>
+            </w:r>
+          </w:p>
+        </w:tc>
+      </w:tr>
+      <w:tr>
+        <w:trPr>
+          <w:cantSplit/>
+        </w:trPr>
+        <w:tc>
+          <w:tcPr>
+            <w:tcW w:type="dxa" w:w="620"/>
+            <w:tcBorders>
+              <w:top w:val="single" w:color="C9D1D9" w:sz="4"/>
+              <w:left w:val="single" w:color="C9D1D9" w:sz="4"/>
+              <w:bottom w:val="single" w:color="C9D1D9" w:sz="4"/>
+              <w:right w:val="single" w:color="C9D1D9" w:sz="4"/>
+            </w:tcBorders>
+            <w:tcMar>
+              <w:top w:type="dxa" w:w="60"/>
+              <w:left w:type="dxa" w:w="90"/>
+              <w:bottom w:type="dxa" w:w="60"/>
+              <w:right w:type="dxa" w:w="90"/>
+            </w:tcMar>
+            <w:vAlign w:val="top"/>
+          </w:tcPr>
+          <w:p>
+            <w:pPr>
+              <w:spacing w:after="20"/>
+            </w:pPr>
+            <w:r>
+              <w:rPr>
+                <w:rFonts w:ascii="Calibri" w:cs="Calibri" w:eastAsia="Calibri" w:hAnsi="Calibri"/>
+                <w:color w:val="1F2A37"/>
+                <w:sz w:val="18"/>
+                <w:szCs w:val="18"/>
+              </w:rPr>
+              <w:t xml:space="preserve">D26</w:t>
+            </w:r>
+          </w:p>
+        </w:tc>
+        <w:tc>
+          <w:tcPr>
+            <w:tcW w:type="dxa" w:w="900"/>
+            <w:tcBorders>
+              <w:top w:val="single" w:color="C9D1D9" w:sz="4"/>
+              <w:left w:val="single" w:color="C9D1D9" w:sz="4"/>
+              <w:bottom w:val="single" w:color="C9D1D9" w:sz="4"/>
+              <w:right w:val="single" w:color="C9D1D9" w:sz="4"/>
+            </w:tcBorders>
+            <w:shd w:fill="FFF0C2" w:color="auto" w:val="clear"/>
+            <w:tcMar>
+              <w:top w:type="dxa" w:w="60"/>
+              <w:left w:type="dxa" w:w="90"/>
+              <w:bottom w:type="dxa" w:w="60"/>
+              <w:right w:type="dxa" w:w="90"/>
+            </w:tcMar>
+            <w:vAlign w:val="top"/>
+          </w:tcPr>
+          <w:p>
+            <w:pPr>
+              <w:spacing w:after="20"/>
+            </w:pPr>
+            <w:r>
+              <w:rPr>
+                <w:rFonts w:ascii="Calibri" w:cs="Calibri" w:eastAsia="Calibri" w:hAnsi="Calibri"/>
+                <w:color w:val="1F2A37"/>
+                <w:sz w:val="18"/>
+                <w:szCs w:val="18"/>
+              </w:rPr>
+              <w:t xml:space="preserve">Medium</w:t>
+            </w:r>
+          </w:p>
+        </w:tc>
+        <w:tc>
+          <w:tcPr>
+            <w:tcW w:type="dxa" w:w="1100"/>
+            <w:tcBorders>
+              <w:top w:val="single" w:color="C9D1D9" w:sz="4"/>
+              <w:left w:val="single" w:color="C9D1D9" w:sz="4"/>
+              <w:bottom w:val="single" w:color="C9D1D9" w:sz="4"/>
+              <w:right w:val="single" w:color="C9D1D9" w:sz="4"/>
+            </w:tcBorders>
+            <w:tcMar>
+              <w:top w:type="dxa" w:w="60"/>
+              <w:left w:type="dxa" w:w="90"/>
+              <w:bottom w:type="dxa" w:w="60"/>
+              <w:right w:type="dxa" w:w="90"/>
+            </w:tcMar>
+            <w:vAlign w:val="top"/>
+          </w:tcPr>
+          <w:p>
+            <w:pPr>
+              <w:spacing w:after="20"/>
+            </w:pPr>
+            <w:r>
+              <w:rPr>
+                <w:rFonts w:ascii="Calibri" w:cs="Calibri" w:eastAsia="Calibri" w:hAnsi="Calibri"/>
+                <w:color w:val="1F2A37"/>
+                <w:sz w:val="18"/>
+                <w:szCs w:val="18"/>
+              </w:rPr>
+              <w:t xml:space="preserve">Module 2</w:t>
+            </w:r>
+          </w:p>
+        </w:tc>
+        <w:tc>
+          <w:tcPr>
+            <w:tcW w:type="dxa" w:w="5146"/>
+            <w:tcBorders>
+              <w:top w:val="single" w:color="C9D1D9" w:sz="4"/>
+              <w:left w:val="single" w:color="C9D1D9" w:sz="4"/>
+              <w:bottom w:val="single" w:color="C9D1D9" w:sz="4"/>
+              <w:right w:val="single" w:color="C9D1D9" w:sz="4"/>
+            </w:tcBorders>
+            <w:tcMar>
+              <w:top w:type="dxa" w:w="60"/>
+              <w:left w:type="dxa" w:w="90"/>
+              <w:bottom w:type="dxa" w:w="60"/>
+              <w:right w:type="dxa" w:w="90"/>
+            </w:tcMar>
+            <w:vAlign w:val="top"/>
+          </w:tcPr>
+          <w:p>
+            <w:pPr>
+              <w:spacing w:after="20"/>
+            </w:pPr>
+            <w:r>
+              <w:rPr>
+                <w:rFonts w:ascii="Calibri" w:cs="Calibri" w:eastAsia="Calibri" w:hAnsi="Calibri"/>
+                <w:color w:val="1F2A37"/>
+                <w:sz w:val="18"/>
+                <w:szCs w:val="18"/>
+              </w:rPr>
+              <w:t xml:space="preserve">RESOLVED 26 Oct (found by comparing with the official instructions at pjps.pk): the built-in PJPS style cut author lists at 6 with "et al." and flagged correct full lists, flagged "pp." on every reference, had no edited-book chapter or website format, and added a DOI link the guidelines do not ask for. Fixed in 3266728 and f73e8b2 and covered by test/pjps-style.js.</w:t>
+            </w:r>
+          </w:p>
+        </w:tc>
+        <w:tc>
+          <w:tcPr>
+            <w:tcW w:type="dxa" w:w="2700"/>
+            <w:tcBorders>
+              <w:top w:val="single" w:color="C9D1D9" w:sz="4"/>
+              <w:left w:val="single" w:color="C9D1D9" w:sz="4"/>
+              <w:bottom w:val="single" w:color="C9D1D9" w:sz="4"/>
+              <w:right w:val="single" w:color="C9D1D9" w:sz="4"/>
+            </w:tcBorders>
+            <w:tcMar>
+              <w:top w:type="dxa" w:w="60"/>
+              <w:left w:type="dxa" w:w="90"/>
+              <w:bottom w:type="dxa" w:w="60"/>
+              <w:right w:type="dxa" w:w="90"/>
+            </w:tcMar>
+            <w:vAlign w:val="top"/>
+          </w:tcPr>
+          <w:p>
+            <w:pPr>
+              <w:spacing w:after="20"/>
+            </w:pPr>
+            <w:r>
+              <w:rPr>
+                <w:rFonts w:ascii="Calibri" w:cs="Calibri" w:eastAsia="Calibri" w:hAnsi="Calibri"/>
+                <w:color w:val="1F2A37"/>
+                <w:sz w:val="18"/>
+                <w:szCs w:val="18"/>
+              </w:rPr>
+              <w:t xml:space="preserve">None: keep the style in step with the instructions page; re-check it when PJPS revises it.</w:t>
             </w:r>
           </w:p>
         </w:tc>
@@ -24279,7 +25915,7 @@
                 <w:sz w:val="18"/>
                 <w:szCs w:val="18"/>
               </w:rPr>
-              <w:t xml:space="preserve">Fixes not committed</w:t>
+              <w:t xml:space="preserve">Style drifting from the journal's instructions</w:t>
             </w:r>
           </w:p>
         </w:tc>
@@ -24292,27 +25928,27 @@
               <w:bottom w:val="single" w:color="C9D1D9" w:sz="4"/>
               <w:right w:val="single" w:color="C9D1D9" w:sz="4"/>
             </w:tcBorders>
-            <w:shd w:fill="FFF0C2" w:color="auto" w:val="clear"/>
-            <w:tcMar>
-              <w:top w:type="dxa" w:w="60"/>
-              <w:left w:type="dxa" w:w="90"/>
-              <w:bottom w:type="dxa" w:w="60"/>
-              <w:right w:type="dxa" w:w="90"/>
-            </w:tcMar>
-            <w:vAlign w:val="top"/>
-          </w:tcPr>
-          <w:p>
-            <w:pPr>
-              <w:spacing w:after="20"/>
-            </w:pPr>
-            <w:r>
-              <w:rPr>
-                <w:rFonts w:ascii="Calibri" w:cs="Calibri" w:eastAsia="Calibri" w:hAnsi="Calibri"/>
-                <w:color w:val="1F2A37"/>
-                <w:sz w:val="18"/>
-                <w:szCs w:val="18"/>
-              </w:rPr>
-              <w:t xml:space="preserve">Medium</w:t>
+            <w:shd w:fill="E5EEF9" w:color="auto" w:val="clear"/>
+            <w:tcMar>
+              <w:top w:type="dxa" w:w="60"/>
+              <w:left w:type="dxa" w:w="90"/>
+              <w:bottom w:type="dxa" w:w="60"/>
+              <w:right w:type="dxa" w:w="90"/>
+            </w:tcMar>
+            <w:vAlign w:val="top"/>
+          </w:tcPr>
+          <w:p>
+            <w:pPr>
+              <w:spacing w:after="20"/>
+            </w:pPr>
+            <w:r>
+              <w:rPr>
+                <w:rFonts w:ascii="Calibri" w:cs="Calibri" w:eastAsia="Calibri" w:hAnsi="Calibri"/>
+                <w:color w:val="1F2A37"/>
+                <w:sz w:val="18"/>
+                <w:szCs w:val="18"/>
+              </w:rPr>
+              <w:t xml:space="preserve">Low</w:t>
             </w:r>
           </w:p>
         </w:tc>
@@ -24344,7 +25980,7 @@
                 <w:sz w:val="18"/>
                 <w:szCs w:val="18"/>
               </w:rPr>
-              <w:t xml:space="preserve">D25: a deployment from the last commit would lose the fixes for D6, D7 and the dataset loader time-out.</w:t>
+              <w:t xml:space="preserve">The PJPS style is a copy of the rules on pjps.pk. If PJPS revises its instructions the app silently disagrees; re-read the page each release (D26).</w:t>
             </w:r>
           </w:p>
         </w:tc>
@@ -25221,7 +26857,7 @@
                 <w:sz w:val="18"/>
                 <w:szCs w:val="18"/>
               </w:rPr>
-              <w:t xml:space="preserve">Commit the pending changes; add one browser test per module screen; re-run the audit scripts.</w:t>
+              <w:t xml:space="preserve">Pending changes are committed (done). Remaining: add one browser test per module screen; re-run the complete audit scripts once on the final code.</w:t>
             </w:r>
           </w:p>
         </w:tc>
@@ -25875,7 +27511,7 @@
           <w:sz w:val="21"/>
           <w:szCs w:val="21"/>
         </w:rPr>
-        <w:t xml:space="preserve">Confirm the PJPS house style against the current author guidelines (the specification says so); it decides the journal-abbreviation form used by Modules 1–2.</w:t>
+        <w:t xml:space="preserve">House style: now checked against the official instructions page (done). Still to confirm with the editor: the instructions show only journal, edited-book and website examples, so theses, reports, conference papers and software are unspecified and fall back to the book format.</w:t>
       </w:r>
     </w:p>
     <w:p>
@@ -26366,6 +28002,75 @@
                 <w:szCs w:val="18"/>
               </w:rPr>
               <w:t xml:space="preserve">Module 4 planted signals, duplicates, tortured phrases, role blocking; Full Screening Report, exports, administration.</w:t>
+            </w:r>
+          </w:p>
+        </w:tc>
+      </w:tr>
+      <w:tr>
+        <w:trPr>
+          <w:cantSplit/>
+        </w:trPr>
+        <w:tc>
+          <w:tcPr>
+            <w:tcW w:type="dxa" w:w="3600"/>
+            <w:tcBorders>
+              <w:top w:val="single" w:color="C9D1D9" w:sz="4"/>
+              <w:left w:val="single" w:color="C9D1D9" w:sz="4"/>
+              <w:bottom w:val="single" w:color="C9D1D9" w:sz="4"/>
+              <w:right w:val="single" w:color="C9D1D9" w:sz="4"/>
+            </w:tcBorders>
+            <w:tcMar>
+              <w:top w:type="dxa" w:w="60"/>
+              <w:left w:type="dxa" w:w="90"/>
+              <w:bottom w:type="dxa" w:w="60"/>
+              <w:right w:type="dxa" w:w="90"/>
+            </w:tcMar>
+            <w:vAlign w:val="top"/>
+          </w:tcPr>
+          <w:p>
+            <w:pPr>
+              <w:spacing w:after="20"/>
+            </w:pPr>
+            <w:r>
+              <w:rPr>
+                <w:rFonts w:ascii="Calibri" w:cs="Calibri" w:eastAsia="Calibri" w:hAnsi="Calibri"/>
+                <w:color w:val="1F2A37"/>
+                <w:sz w:val="18"/>
+                <w:szCs w:val="18"/>
+              </w:rPr>
+              <w:t xml:space="preserve">node test/pjps-style.js</w:t>
+            </w:r>
+          </w:p>
+        </w:tc>
+        <w:tc>
+          <w:tcPr>
+            <w:tcW w:type="dxa" w:w="6866"/>
+            <w:tcBorders>
+              <w:top w:val="single" w:color="C9D1D9" w:sz="4"/>
+              <w:left w:val="single" w:color="C9D1D9" w:sz="4"/>
+              <w:bottom w:val="single" w:color="C9D1D9" w:sz="4"/>
+              <w:right w:val="single" w:color="C9D1D9" w:sz="4"/>
+            </w:tcBorders>
+            <w:tcMar>
+              <w:top w:type="dxa" w:w="60"/>
+              <w:left w:type="dxa" w:w="90"/>
+              <w:bottom w:type="dxa" w:w="60"/>
+              <w:right w:type="dxa" w:w="90"/>
+            </w:tcMar>
+            <w:vAlign w:val="top"/>
+          </w:tcPr>
+          <w:p>
+            <w:pPr>
+              <w:spacing w:after="20"/>
+            </w:pPr>
+            <w:r>
+              <w:rPr>
+                <w:rFonts w:ascii="Calibri" w:cs="Calibri" w:eastAsia="Calibri" w:hAnsi="Calibri"/>
+                <w:color w:val="1F2A37"/>
+                <w:sz w:val="18"/>
+                <w:szCs w:val="18"/>
+              </w:rPr>
+              <w:t xml:space="preserve">The three official PJPS reference examples (journal, edited-book chapter, website) read and re-formatted exactly; all authors, italic journal, bold volume.</w:t>
             </w:r>
           </w:p>
         </w:tc>

</xml_diff>